<commit_message>
starting module 01 jv
</commit_message>
<xml_diff>
--- a/Javascript/Js_Module_01/Module_01_js.docx
+++ b/Javascript/Js_Module_01/Module_01_js.docx
@@ -453,25 +453,7 @@
                 <w:noProof/>
                 <w:lang w:val="es-ES"/>
               </w:rPr>
-              <w:t xml:space="preserve">00: La </w:t>
-            </w:r>
-            <w:r>
-              <w:rPr>
-                <w:rStyle w:val="Hipervnculo"/>
-                <w:bCs/>
-                <w:noProof/>
-                <w:lang w:val="es-ES"/>
-              </w:rPr>
-              <w:t>P</w:t>
-            </w:r>
-            <w:r>
-              <w:rPr>
-                <w:rStyle w:val="Hipervnculo"/>
-                <w:bCs/>
-                <w:noProof/>
-                <w:lang w:val="es-ES"/>
-              </w:rPr>
-              <w:t>uerta de Entrada</w:t>
+              <w:t>00: La Puerta de Entrada</w:t>
             </w:r>
             <w:r>
               <w:rPr>
@@ -2927,8 +2909,6 @@
         </w:rPr>
         <w:t xml:space="preserve">√ What type of modules does your project use? · </w:t>
       </w:r>
-      <w:proofErr w:type="spellStart"/>
-      <w:proofErr w:type="gramStart"/>
       <w:r>
         <w:rPr>
           <w:b/>
@@ -2938,10 +2918,19 @@
           <w:sz w:val="18"/>
           <w:szCs w:val="18"/>
         </w:rPr>
-        <w:t>esm</w:t>
-      </w:r>
-      <w:proofErr w:type="spellEnd"/>
-      <w:proofErr w:type="gramEnd"/>
+        <w:t>JavaScript modules (import/export)</w:t>
+      </w:r>
+      <w:r>
+        <w:rPr>
+          <w:b/>
+          <w:bCs/>
+          <w:i/>
+          <w:iCs/>
+          <w:sz w:val="18"/>
+          <w:szCs w:val="18"/>
+        </w:rPr>
+        <w:t xml:space="preserve"> – Actual</w:t>
+      </w:r>
     </w:p>
     <w:p>
       <w:pPr>
@@ -6152,7 +6141,7 @@
           <w:noProof/>
         </w:rPr>
         <w:drawing>
-          <wp:inline distT="0" distB="0" distL="0" distR="0" wp14:anchorId="4BFDE7AC" wp14:editId="1C94B5F4">
+          <wp:inline distT="0" distB="0" distL="0" distR="0" wp14:anchorId="4BFDE7AC" wp14:editId="3FEE61FE">
             <wp:extent cx="4949190" cy="3299460"/>
             <wp:effectExtent l="114300" t="114300" r="156210" b="148590"/>
             <wp:docPr id="1256845824" name="Imagen 7" descr="DC's Got a Lot of Superman Coming This Summer"/>
@@ -6536,7 +6525,7 @@
         </w:rPr>
         <w:lastRenderedPageBreak/>
         <w:drawing>
-          <wp:anchor distT="0" distB="0" distL="114300" distR="114300" simplePos="0" relativeHeight="251678720" behindDoc="0" locked="0" layoutInCell="1" allowOverlap="1" wp14:anchorId="1C79BC5C" wp14:editId="34AAEEB7">
+          <wp:anchor distT="0" distB="0" distL="114300" distR="114300" simplePos="0" relativeHeight="251678720" behindDoc="0" locked="0" layoutInCell="1" allowOverlap="1" wp14:anchorId="1C79BC5C" wp14:editId="73B69E93">
             <wp:simplePos x="0" y="0"/>
             <wp:positionH relativeFrom="column">
               <wp:posOffset>4260850</wp:posOffset>
@@ -7259,84 +7248,95 @@
         <w:rPr>
           <w:i/>
           <w:iCs/>
-        </w:rPr>
-      </w:pPr>
+          <w:lang w:val="es-ES"/>
+        </w:rPr>
+      </w:pPr>
+      <w:proofErr w:type="spellStart"/>
       <w:r>
         <w:rPr>
           <w:i/>
           <w:iCs/>
-        </w:rPr>
-        <w:t>node tk_secure_input.js Tomate 42</w:t>
-      </w:r>
-    </w:p>
-    <w:p>
-      <w:pPr>
-        <w:pStyle w:val="Sinespaciado"/>
-        <w:rPr>
-          <w:b/>
-          <w:bCs/>
-        </w:rPr>
-      </w:pPr>
-      <w:proofErr w:type="spellStart"/>
+          <w:lang w:val="es-ES"/>
+        </w:rPr>
+        <w:t>node</w:t>
+      </w:r>
+      <w:proofErr w:type="spellEnd"/>
       <w:r>
         <w:rPr>
           <w:i/>
           <w:iCs/>
-        </w:rPr>
-        <w:t>Cultivo</w:t>
-      </w:r>
-      <w:proofErr w:type="spellEnd"/>
+          <w:lang w:val="es-ES"/>
+        </w:rPr>
+        <w:t xml:space="preserve"> tk_secure_input.js Tomate 42</w:t>
+      </w:r>
+    </w:p>
+    <w:p>
+      <w:pPr>
+        <w:pStyle w:val="Sinespaciado"/>
+        <w:rPr>
+          <w:b/>
+          <w:bCs/>
+          <w:lang w:val="es-ES"/>
+        </w:rPr>
+      </w:pPr>
       <w:r>
         <w:rPr>
           <w:i/>
           <w:iCs/>
-        </w:rPr>
-        <w:t xml:space="preserve"> </w:t>
-      </w:r>
-      <w:proofErr w:type="spellStart"/>
-      <w:proofErr w:type="gramStart"/>
+          <w:lang w:val="es-ES"/>
+        </w:rPr>
+        <w:t xml:space="preserve">Cultivo registrado: </w:t>
+      </w:r>
       <w:r>
         <w:rPr>
           <w:i/>
           <w:iCs/>
-        </w:rPr>
-        <w:t>registrado</w:t>
-      </w:r>
-      <w:proofErr w:type="spellEnd"/>
+          <w:lang w:val="es-ES"/>
+        </w:rPr>
+        <w:t>{</w:t>
+      </w:r>
+      <w:proofErr w:type="spellStart"/>
       <w:r>
         <w:rPr>
           <w:i/>
           <w:iCs/>
-        </w:rPr>
-        <w:t xml:space="preserve">: </w:t>
-      </w:r>
+          <w:lang w:val="es-ES"/>
+        </w:rPr>
+        <w:t>name</w:t>
+      </w:r>
+      <w:proofErr w:type="spellEnd"/>
       <w:r>
         <w:rPr>
           <w:i/>
           <w:iCs/>
-        </w:rPr>
-        <w:t>{</w:t>
-      </w:r>
-      <w:proofErr w:type="gramEnd"/>
+          <w:lang w:val="es-ES"/>
+        </w:rPr>
+        <w:t xml:space="preserve">: 'Tomate', </w:t>
+      </w:r>
+      <w:proofErr w:type="spellStart"/>
       <w:r>
         <w:rPr>
           <w:i/>
           <w:iCs/>
-        </w:rPr>
-        <w:t>name</w:t>
-      </w:r>
+          <w:lang w:val="es-ES"/>
+        </w:rPr>
+        <w:t>qty</w:t>
+      </w:r>
+      <w:proofErr w:type="spellEnd"/>
       <w:r>
         <w:rPr>
           <w:i/>
           <w:iCs/>
-        </w:rPr>
-        <w:t xml:space="preserve">: 'Tomate', qty: </w:t>
+          <w:lang w:val="es-ES"/>
+        </w:rPr>
+        <w:t xml:space="preserve">: </w:t>
       </w:r>
       <w:proofErr w:type="gramStart"/>
       <w:r>
         <w:rPr>
           <w:i/>
           <w:iCs/>
+          <w:lang w:val="es-ES"/>
         </w:rPr>
         <w:t>42 }</w:t>
       </w:r>
@@ -7348,6 +7348,7 @@
         <w:rPr>
           <w:b/>
           <w:bCs/>
+          <w:lang w:val="es-ES"/>
         </w:rPr>
       </w:pPr>
     </w:p>
@@ -7439,40 +7440,17 @@
         <w:rPr>
           <w:b/>
           <w:bCs/>
-        </w:rPr>
-      </w:pPr>
-      <w:r>
-        <w:rPr>
-          <w:b/>
-          <w:bCs/>
-        </w:rPr>
-        <w:t xml:space="preserve">Si </w:t>
-      </w:r>
-      <w:proofErr w:type="spellStart"/>
-      <w:r>
-        <w:rPr>
-          <w:b/>
-          <w:bCs/>
-        </w:rPr>
-        <w:t>faltan</w:t>
-      </w:r>
-      <w:proofErr w:type="spellEnd"/>
-      <w:r>
-        <w:rPr>
-          <w:b/>
-          <w:bCs/>
-        </w:rPr>
-        <w:t xml:space="preserve"> </w:t>
-      </w:r>
-      <w:proofErr w:type="spellStart"/>
-      <w:r>
-        <w:rPr>
-          <w:b/>
-          <w:bCs/>
-        </w:rPr>
-        <w:t>argumentos</w:t>
-      </w:r>
-      <w:proofErr w:type="spellEnd"/>
+          <w:lang w:val="es-ES"/>
+        </w:rPr>
+      </w:pPr>
+      <w:r>
+        <w:rPr>
+          <w:b/>
+          <w:bCs/>
+          <w:lang w:val="es-ES"/>
+        </w:rPr>
+        <w:t>Si faltan argumentos</w:t>
+      </w:r>
     </w:p>
     <w:p>
       <w:pPr>
@@ -7938,7 +7916,7 @@
     <w:p>
       <w:r>
         <w:pict w14:anchorId="5670CF01">
-          <v:rect id="_x0000_i1056" style="width:0;height:1.5pt" o:hralign="center" o:hrstd="t" o:hr="t" fillcolor="#a0a0a0" stroked="f"/>
+          <v:rect id="_x0000_i1027" style="width:0;height:1.5pt" o:hralign="center" o:hrstd="t" o:hr="t" fillcolor="#a0a0a0" stroked="f"/>
         </w:pict>
       </w:r>
     </w:p>

</xml_diff>